<commit_message>
EL7: audit fixes (unambiguous compound-interest speech, balanced choices, text-spacing reflow), audit notes, final support files and index
Co-Authored-By: Claude Opus 5.5 <noreply@anthropic.com>
Claude-Session: https://claude.ai/code/session_013Y8PfETWcMLvmUEpCdE8Wq
</commit_message>
<xml_diff>
--- a/support-materials/EL7/EL7_worked_examples.docx
+++ b/support-materials/EL7/EL7_worked_examples.docx
@@ -330,6 +330,36 @@
         <w:t xml:space="preserve">t</w:t>
       </w:r>
       <w:r>
+        <w:t xml:space="preserve">. Inside the parentheses, </w:t>
+      </w:r>
+      <w:r>
+        <w:rPr>
+          <w:i/>
+          <w:iCs/>
+        </w:rPr>
+        <w:t xml:space="preserve">0.04</w:t>
+      </w:r>
+      <w:r>
+        <w:t xml:space="preserve"> divided by 4 is </w:t>
+      </w:r>
+      <w:r>
+        <w:rPr>
+          <w:i/>
+          <w:iCs/>
+        </w:rPr>
+        <w:t xml:space="preserve">0.01</w:t>
+      </w:r>
+      <w:r>
+        <w:t xml:space="preserve">, so the base is </w:t>
+      </w:r>
+      <w:r>
+        <w:rPr>
+          <w:i/>
+          <w:iCs/>
+        </w:rPr>
+        <w:t xml:space="preserve">1.01</w:t>
+      </w:r>
+      <w:r>
         <w:t xml:space="preserve">. Using 4 instead of 0.04 would double the money every quarter. </w:t>
       </w:r>
       <w:r>
@@ -346,7 +376,7 @@
           <w:i/>
           <w:iCs/>
         </w:rPr>
-        <w:t xml:space="preserve">A(t)=15000(1+0.04/4)</w:t>
+        <w:t xml:space="preserve">A(t)=15000(1.01)</w:t>
       </w:r>
       <w:r>
         <w:rPr>
@@ -363,7 +393,7 @@
           <w:b/>
           <w:bCs/>
         </w:rPr>
-        <w:t xml:space="preserve">.</w:t>
+        <w:t xml:space="preserve">, written with the rate 0.04 divided by 4.</w:t>
       </w:r>
     </w:p>
     <w:p>
@@ -1228,7 +1258,7 @@
           <w:sz w:val="40"/>
           <w:szCs w:val="40"/>
         </w:rPr>
-        <w:t xml:space="preserve">A(t)=15000(1+0.04/4)</w:t>
+        <w:t xml:space="preserve">A(t)=15000(1.01)</w:t>
       </w:r>
       <w:r>
         <w:rPr>
@@ -1363,10 +1393,10 @@
           <w:i/>
           <w:iCs/>
         </w:rPr>
-        <w:t xml:space="preserve">1+0.01=1.01</w:t>
-      </w:r>
-      <w:r>
-        <w:t xml:space="preserve">. So </w:t>
+        <w:t xml:space="preserve">1.01</w:t>
+      </w:r>
+      <w:r>
+        <w:t xml:space="preserve">, because 0.04 divided by 4 is 0.01. So </w:t>
       </w:r>
       <w:r>
         <w:rPr>
@@ -1391,7 +1421,7 @@
         <w:t xml:space="preserve">≈ 22332.96</w:t>
       </w:r>
       <w:r>
-        <w:t xml:space="preserve">. The answer $22,204 ignores the compounding, $16,569 uses an exponent of 10 instead of 40, and $72,015 forgets to divide the rate by 4. </w:t>
+        <w:t xml:space="preserve">. The answer $22,204 compounds once a year instead of quarterly, $16,569 uses an exponent of 10 instead of 40, and $72,015 forgets to divide the rate by 4. </w:t>
       </w:r>
       <w:r>
         <w:rPr>
@@ -1513,7 +1543,7 @@
         <w:t xml:space="preserve">D.  </w:t>
       </w:r>
       <w:r>
-        <w:t xml:space="preserve">$39,999.70</w:t>
+        <w:t xml:space="preserve">$38,000</w:t>
       </w:r>
     </w:p>
     <w:p>
@@ -1575,7 +1605,7 @@
         <w:t xml:space="preserve">1.05</w:t>
       </w:r>
       <w:r>
-        <w:t xml:space="preserve">, so the car gains value. </w:t>
+        <w:t xml:space="preserve">, so the car gains value, and $38,000 applies the 5% loss only once. </w:t>
       </w:r>
       <w:r>
         <w:rPr>
@@ -1957,7 +1987,7 @@
           <w:sz w:val="40"/>
           <w:szCs w:val="40"/>
         </w:rPr>
-        <w:t xml:space="preserve">28590=20000(1+0.03/2)</w:t>
+        <w:t xml:space="preserve">28590=20000(1.015)</w:t>
       </w:r>
       <w:r>
         <w:rPr>
@@ -2000,7 +2030,7 @@
         <w:t xml:space="preserve">A.  </w:t>
       </w:r>
       <w:r>
-        <w:t xml:space="preserve">12 years</w:t>
+        <w:t xml:space="preserve">about 12 years</w:t>
       </w:r>
     </w:p>
     <w:p>
@@ -2016,7 +2046,7 @@
         <w:t xml:space="preserve">B.  </w:t>
       </w:r>
       <w:r>
-        <w:t xml:space="preserve">24 years</w:t>
+        <w:t xml:space="preserve">about 24 years</w:t>
       </w:r>
     </w:p>
     <w:p>
@@ -2254,7 +2284,7 @@
         <w:t xml:space="preserve">C.  </w:t>
       </w:r>
       <w:r>
-        <w:t xml:space="preserve">8 years</w:t>
+        <w:t xml:space="preserve">about 8 years</w:t>
       </w:r>
     </w:p>
     <w:p>
@@ -2637,7 +2667,7 @@
         <w:t xml:space="preserve">B.  </w:t>
       </w:r>
       <w:r>
-        <w:t xml:space="preserve">7 days</w:t>
+        <w:t xml:space="preserve">about 7 days</w:t>
       </w:r>
     </w:p>
     <w:p>
@@ -2815,7 +2845,7 @@
         <w:t xml:space="preserve">A.  </w:t>
       </w:r>
       <w:r>
-        <w:t xml:space="preserve">The exponent should be 4.5 t.</w:t>
+        <w:t xml:space="preserve">The exponent should be 4.5 t, because the rate goes in the exponent.</w:t>
       </w:r>
     </w:p>
     <w:p>
@@ -2831,7 +2861,7 @@
         <w:t xml:space="preserve">B.  </w:t>
       </w:r>
       <w:r>
-        <w:t xml:space="preserve">The rate should be written as the decimal 0.045, not 4.5.</w:t>
+        <w:t xml:space="preserve">The rate should be the decimal 0.045, not 4.5.</w:t>
       </w:r>
     </w:p>
     <w:p>
@@ -2847,7 +2877,7 @@
         <w:t xml:space="preserve">C.  </w:t>
       </w:r>
       <w:r>
-        <w:t xml:space="preserve">The plus sign should be a minus sign.</w:t>
+        <w:t xml:space="preserve">The plus sign should be a minus sign, because interest is taken out.</w:t>
       </w:r>
     </w:p>
     <w:p>
@@ -2990,7 +3020,7 @@
         <w:t xml:space="preserve">A.  </w:t>
       </w:r>
       <w:r>
-        <w:t xml:space="preserve">The rate should be 3, not 0.03.</w:t>
+        <w:t xml:space="preserve">The rate should be 3, because the percent is already given.</w:t>
       </w:r>
     </w:p>
     <w:p>
@@ -3006,7 +3036,7 @@
         <w:t xml:space="preserve">B.  </w:t>
       </w:r>
       <w:r>
-        <w:t xml:space="preserve">The 6 should appear only in the exponent.</w:t>
+        <w:t xml:space="preserve">The 6 should appear only in the exponent, not under the rate.</w:t>
       </w:r>
     </w:p>
     <w:p>
@@ -3065,6 +3095,16 @@
         <w:t xml:space="preserve">n=2</w:t>
       </w:r>
       <w:r>
+        <w:t xml:space="preserve">: the rate is 0.03 divided by 2, which is </w:t>
+      </w:r>
+      <w:r>
+        <w:rPr>
+          <w:i/>
+          <w:iCs/>
+        </w:rPr>
+        <w:t xml:space="preserve">0.015</w:t>
+      </w:r>
+      <w:r>
         <w:t xml:space="preserve">. </w:t>
       </w:r>
       <w:r>
@@ -3081,7 +3121,7 @@
           <w:i/>
           <w:iCs/>
         </w:rPr>
-        <w:t xml:space="preserve">A(t)=P(1+0.03/2)</w:t>
+        <w:t xml:space="preserve">A(t)=P(1.015)</w:t>
       </w:r>
       <w:r>
         <w:rPr>
@@ -3165,7 +3205,7 @@
         <w:t xml:space="preserve">A.  </w:t>
       </w:r>
       <w:r>
-        <w:t xml:space="preserve">Losing value means the factor is 1 minus 0.06, which is 0.94.</w:t>
+        <w:t xml:space="preserve">Losing value means the factor should be 0.94.</w:t>
       </w:r>
     </w:p>
     <w:p>
@@ -3181,7 +3221,7 @@
         <w:t xml:space="preserve">B.  </w:t>
       </w:r>
       <w:r>
-        <w:t xml:space="preserve">The factor should be 0.06.</w:t>
+        <w:t xml:space="preserve">The factor should be 0.06, the amount lost each year.</w:t>
       </w:r>
     </w:p>
     <w:p>
@@ -3197,7 +3237,7 @@
         <w:t xml:space="preserve">C.  </w:t>
       </w:r>
       <w:r>
-        <w:t xml:space="preserve">The exponent should be 6 t.</w:t>
+        <w:t xml:space="preserve">The exponent should be 6 t, to match the 6 percent.</w:t>
       </w:r>
     </w:p>
     <w:p>
@@ -3399,7 +3439,7 @@
         <w:t xml:space="preserve">B.  </w:t>
       </w:r>
       <w:r>
-        <w:t xml:space="preserve">The 20000 should have been divided by 1.2.</w:t>
+        <w:t xml:space="preserve">The student should divide 20000 by 1.2 to undo the power.</w:t>
       </w:r>
     </w:p>
     <w:p>
@@ -3415,7 +3455,7 @@
         <w:t xml:space="preserve">C.  </w:t>
       </w:r>
       <w:r>
-        <w:t xml:space="preserve">The student should have subtracted 5000 from both sides.</w:t>
+        <w:t xml:space="preserve">The student should subtract 5000 from both sides first.</w:t>
       </w:r>
     </w:p>
     <w:p>
@@ -3431,7 +3471,7 @@
         <w:t xml:space="preserve">D.  </w:t>
       </w:r>
       <w:r>
-        <w:t xml:space="preserve">Only the 1.2 is raised to the power t, so 5000 cannot be multiplied into it. Divide by 5000 instead.</w:t>
+        <w:t xml:space="preserve">Only 1.2 is raised to the power t. Divide by 5000 first.</w:t>
       </w:r>
     </w:p>
     <w:p>

</xml_diff>